<commit_message>
Correct Mendix Manager promotion and Copywriter end dates
Manager, Content Marketing moved from Sept 2020 to May 2020; Copywriter
now ends April 2020 instead of September 2020. Updated the master work
history and the Cato Networks resume to match.

Co-Authored-By: Claude Sonnet 5 <noreply@anthropic.com>
Claude-Session: https://claude.ai/code/session_01HGwMf3WQEWpBH5LDYWi1id
</commit_message>
<xml_diff>
--- a/Taylor-Bornstein-Resume-Cato-Networks.docx
+++ b/Taylor-Bornstein-Resume-Cato-Networks.docx
@@ -318,7 +318,7 @@
           <w:sz w:val="18"/>
           <w:szCs w:val="18"/>
         </w:rPr>
-        <w:t xml:space="preserve">	Sep 2020 – Jul 2023  |  Remote</w:t>
+        <w:t xml:space="preserve">	May 2020 – Jul 2023  |  Remote</w:t>
       </w:r>
     </w:p>
     <w:p>
@@ -401,7 +401,7 @@
           <w:sz w:val="18"/>
           <w:szCs w:val="18"/>
         </w:rPr>
-        <w:t xml:space="preserve">	Sep 2019 – Sep 2020  |  Remote</w:t>
+        <w:t xml:space="preserve">	Sep 2019 – Apr 2020  |  Remote</w:t>
       </w:r>
     </w:p>
     <w:p>

</xml_diff>